<commit_message>
Document the two data paths in the setup guide
New section 1.0 puts the choice before the infrastructure it implies, because
picking QVD or Gateway decides whether most of section 1 applies at all. Side
by side table of what each needs, the note that pipelines cannot run without a
gateway, and the fact that everything above storage is identical either way.

mysql_crm_setup.md gets a "do you even need this?" opener - in QVD mode the CRM
database is never touched.

Both the hand-written guide and gen-setup-guide.js are updated together, and
the rebuilt MCG_Setup_Guide.docx was unzipped and grepped to confirm the
section is actually in the artifact.

Co-Authored-By: Claude Opus 5 <noreply@anthropic.com>
</commit_message>
<xml_diff>
--- a/documents/MCG_Setup_Guide.docx
+++ b/documents/MCG_Setup_Guide.docx
@@ -484,6 +484,925 @@
           <w:szCs w:val="30"/>
         </w:rPr>
         <w:t xml:space="preserve">1. Prerequisites</w:t>
+      </w:r>
+    </w:p>
+    <w:p>
+      <w:pPr>
+        <w:spacing w:after="120" w:before="280"/>
+      </w:pPr>
+      <w:r>
+        <w:rPr>
+          <w:rFonts w:ascii="Inter" w:cs="Inter" w:eastAsia="Inter" w:hAnsi="Inter"/>
+          <w:b/>
+          <w:bCs/>
+          <w:color w:val="006580"/>
+          <w:sz w:val="26"/>
+          <w:szCs w:val="26"/>
+        </w:rPr>
+        <w:t xml:space="preserve">1.0 Pick a data path first</w:t>
+      </w:r>
+    </w:p>
+    <w:p>
+      <w:pPr>
+        <w:spacing w:after="120"/>
+        <w:jc w:val="left"/>
+      </w:pPr>
+      <w:r>
+        <w:rPr>
+          <w:rFonts w:ascii="Inter" w:cs="Inter" w:eastAsia="Inter" w:hAnsi="Inter"/>
+          <w:b w:val="false"/>
+          <w:bCs w:val="false"/>
+          <w:i w:val="false"/>
+          <w:iCs w:val="false"/>
+          <w:color w:val="454659"/>
+          <w:sz w:val="21"/>
+          <w:szCs w:val="21"/>
+        </w:rPr>
+        <w:t xml:space="preserve">Everything in this section depends on one choice, and it is the choice that decides how much infrastructure you actually need.</w:t>
+      </w:r>
+    </w:p>
+    <w:tbl>
+      <w:tblPr>
+        <w:tblW w:type="pct" w:w="100%"/>
+        <w:tblBorders>
+          <w:top w:val="single" w:color="auto" w:sz="4"/>
+          <w:left w:val="single" w:color="auto" w:sz="4"/>
+          <w:bottom w:val="single" w:color="auto" w:sz="4"/>
+          <w:right w:val="single" w:color="auto" w:sz="4"/>
+          <w:insideH w:val="single" w:color="auto" w:sz="4"/>
+          <w:insideV w:val="single" w:color="auto" w:sz="4"/>
+        </w:tblBorders>
+      </w:tblPr>
+      <w:tblGrid>
+        <w:gridCol w:w="100"/>
+        <w:gridCol w:w="100"/>
+        <w:gridCol w:w="100"/>
+      </w:tblGrid>
+      <w:tr>
+        <w:trPr>
+          <w:tblHeader/>
+        </w:trPr>
+        <w:tc>
+          <w:tcPr>
+            <w:shd w:color="006580" w:val="solid"/>
+            <w:tcMar>
+              <w:top w:type="dxa" w:w="40"/>
+              <w:left w:type="dxa" w:w="80"/>
+              <w:bottom w:type="dxa" w:w="40"/>
+              <w:right w:type="dxa" w:w="80"/>
+            </w:tcMar>
+          </w:tcPr>
+          <w:p>
+            <w:pPr>
+              <w:spacing w:after="0"/>
+            </w:pPr>
+            <w:r>
+              <w:rPr>
+                <w:rFonts w:ascii="Inter" w:cs="Inter" w:eastAsia="Inter" w:hAnsi="Inter"/>
+                <w:b/>
+                <w:bCs/>
+                <w:color w:val="FFFFFF"/>
+                <w:sz w:val="19"/>
+                <w:szCs w:val="19"/>
+              </w:rPr>
+              <w:t xml:space="preserve"/>
+            </w:r>
+          </w:p>
+        </w:tc>
+        <w:tc>
+          <w:tcPr>
+            <w:shd w:color="006580" w:val="solid"/>
+            <w:tcMar>
+              <w:top w:type="dxa" w:w="40"/>
+              <w:left w:type="dxa" w:w="80"/>
+              <w:bottom w:type="dxa" w:w="40"/>
+              <w:right w:type="dxa" w:w="80"/>
+            </w:tcMar>
+          </w:tcPr>
+          <w:p>
+            <w:pPr>
+              <w:spacing w:after="0"/>
+            </w:pPr>
+            <w:r>
+              <w:rPr>
+                <w:rFonts w:ascii="Inter" w:cs="Inter" w:eastAsia="Inter" w:hAnsi="Inter"/>
+                <w:b/>
+                <w:bCs/>
+                <w:color w:val="FFFFFF"/>
+                <w:sz w:val="19"/>
+                <w:szCs w:val="19"/>
+              </w:rPr>
+              <w:t xml:space="preserve">QVD staging</w:t>
+            </w:r>
+          </w:p>
+        </w:tc>
+        <w:tc>
+          <w:tcPr>
+            <w:shd w:color="006580" w:val="solid"/>
+            <w:tcMar>
+              <w:top w:type="dxa" w:w="40"/>
+              <w:left w:type="dxa" w:w="80"/>
+              <w:bottom w:type="dxa" w:w="40"/>
+              <w:right w:type="dxa" w:w="80"/>
+            </w:tcMar>
+          </w:tcPr>
+          <w:p>
+            <w:pPr>
+              <w:spacing w:after="0"/>
+            </w:pPr>
+            <w:r>
+              <w:rPr>
+                <w:rFonts w:ascii="Inter" w:cs="Inter" w:eastAsia="Inter" w:hAnsi="Inter"/>
+                <w:b/>
+                <w:bCs/>
+                <w:color w:val="FFFFFF"/>
+                <w:sz w:val="19"/>
+                <w:szCs w:val="19"/>
+              </w:rPr>
+              <w:t xml:space="preserve">Gateway CDC</w:t>
+            </w:r>
+          </w:p>
+        </w:tc>
+      </w:tr>
+      <w:tr>
+        <w:tc>
+          <w:tcPr>
+            <w:shd w:color="F6F7F8" w:val="solid"/>
+            <w:tcMar>
+              <w:top w:type="dxa" w:w="30"/>
+              <w:left w:type="dxa" w:w="80"/>
+              <w:bottom w:type="dxa" w:w="30"/>
+              <w:right w:type="dxa" w:w="80"/>
+            </w:tcMar>
+          </w:tcPr>
+          <w:p>
+            <w:pPr>
+              <w:spacing w:after="0"/>
+            </w:pPr>
+            <w:r>
+              <w:rPr>
+                <w:rFonts w:ascii="Inter" w:cs="Inter" w:eastAsia="Inter" w:hAnsi="Inter"/>
+                <w:color w:val="454659"/>
+                <w:sz w:val="19"/>
+                <w:szCs w:val="19"/>
+              </w:rPr>
+              <w:t xml:space="preserve">Config</w:t>
+            </w:r>
+          </w:p>
+        </w:tc>
+        <w:tc>
+          <w:tcPr>
+            <w:shd w:color="F6F7F8" w:val="solid"/>
+            <w:tcMar>
+              <w:top w:type="dxa" w:w="30"/>
+              <w:left w:type="dxa" w:w="80"/>
+              <w:bottom w:type="dxa" w:w="30"/>
+              <w:right w:type="dxa" w:w="80"/>
+            </w:tcMar>
+          </w:tcPr>
+          <w:p>
+            <w:pPr>
+              <w:spacing w:after="0"/>
+            </w:pPr>
+            <w:r>
+              <w:rPr>
+                <w:rFonts w:ascii="Inter" w:cs="Inter" w:eastAsia="Inter" w:hAnsi="Inter"/>
+                <w:color w:val="454659"/>
+                <w:sz w:val="19"/>
+                <w:szCs w:val="19"/>
+              </w:rPr>
+              <w:t xml:space="preserve">deployMode: "qvd"</w:t>
+            </w:r>
+          </w:p>
+        </w:tc>
+        <w:tc>
+          <w:tcPr>
+            <w:shd w:color="F6F7F8" w:val="solid"/>
+            <w:tcMar>
+              <w:top w:type="dxa" w:w="30"/>
+              <w:left w:type="dxa" w:w="80"/>
+              <w:bottom w:type="dxa" w:w="30"/>
+              <w:right w:type="dxa" w:w="80"/>
+            </w:tcMar>
+          </w:tcPr>
+          <w:p>
+            <w:pPr>
+              <w:spacing w:after="0"/>
+            </w:pPr>
+            <w:r>
+              <w:rPr>
+                <w:rFonts w:ascii="Inter" w:cs="Inter" w:eastAsia="Inter" w:hAnsi="Inter"/>
+                <w:color w:val="454659"/>
+                <w:sz w:val="19"/>
+                <w:szCs w:val="19"/>
+              </w:rPr>
+              <w:t xml:space="preserve">deployMode: "gateway"</w:t>
+            </w:r>
+          </w:p>
+        </w:tc>
+      </w:tr>
+      <w:tr>
+        <w:tc>
+          <w:tcPr>
+            <w:tcMar>
+              <w:top w:type="dxa" w:w="30"/>
+              <w:left w:type="dxa" w:w="80"/>
+              <w:bottom w:type="dxa" w:w="30"/>
+              <w:right w:type="dxa" w:w="80"/>
+            </w:tcMar>
+          </w:tcPr>
+          <w:p>
+            <w:pPr>
+              <w:spacing w:after="0"/>
+            </w:pPr>
+            <w:r>
+              <w:rPr>
+                <w:rFonts w:ascii="Inter" w:cs="Inter" w:eastAsia="Inter" w:hAnsi="Inter"/>
+                <w:color w:val="454659"/>
+                <w:sz w:val="19"/>
+                <w:szCs w:val="19"/>
+              </w:rPr>
+              <w:t xml:space="preserve">Command</w:t>
+            </w:r>
+          </w:p>
+        </w:tc>
+        <w:tc>
+          <w:tcPr>
+            <w:tcMar>
+              <w:top w:type="dxa" w:w="30"/>
+              <w:left w:type="dxa" w:w="80"/>
+              <w:bottom w:type="dxa" w:w="30"/>
+              <w:right w:type="dxa" w:w="80"/>
+            </w:tcMar>
+          </w:tcPr>
+          <w:p>
+            <w:pPr>
+              <w:spacing w:after="0"/>
+            </w:pPr>
+            <w:r>
+              <w:rPr>
+                <w:rFonts w:ascii="Inter" w:cs="Inter" w:eastAsia="Inter" w:hAnsi="Inter"/>
+                <w:color w:val="454659"/>
+                <w:sz w:val="19"/>
+                <w:szCs w:val="19"/>
+              </w:rPr>
+              <w:t xml:space="preserve">npm run deploy:qvd</w:t>
+            </w:r>
+          </w:p>
+        </w:tc>
+        <w:tc>
+          <w:tcPr>
+            <w:tcMar>
+              <w:top w:type="dxa" w:w="30"/>
+              <w:left w:type="dxa" w:w="80"/>
+              <w:bottom w:type="dxa" w:w="30"/>
+              <w:right w:type="dxa" w:w="80"/>
+            </w:tcMar>
+          </w:tcPr>
+          <w:p>
+            <w:pPr>
+              <w:spacing w:after="0"/>
+            </w:pPr>
+            <w:r>
+              <w:rPr>
+                <w:rFonts w:ascii="Inter" w:cs="Inter" w:eastAsia="Inter" w:hAnsi="Inter"/>
+                <w:color w:val="454659"/>
+                <w:sz w:val="19"/>
+                <w:szCs w:val="19"/>
+              </w:rPr>
+              <w:t xml:space="preserve">npm run deploy:gateway</w:t>
+            </w:r>
+          </w:p>
+        </w:tc>
+      </w:tr>
+      <w:tr>
+        <w:tc>
+          <w:tcPr>
+            <w:shd w:color="F6F7F8" w:val="solid"/>
+            <w:tcMar>
+              <w:top w:type="dxa" w:w="30"/>
+              <w:left w:type="dxa" w:w="80"/>
+              <w:bottom w:type="dxa" w:w="30"/>
+              <w:right w:type="dxa" w:w="80"/>
+            </w:tcMar>
+          </w:tcPr>
+          <w:p>
+            <w:pPr>
+              <w:spacing w:after="0"/>
+            </w:pPr>
+            <w:r>
+              <w:rPr>
+                <w:rFonts w:ascii="Inter" w:cs="Inter" w:eastAsia="Inter" w:hAnsi="Inter"/>
+                <w:color w:val="454659"/>
+                <w:sz w:val="19"/>
+                <w:szCs w:val="19"/>
+              </w:rPr>
+              <w:t xml:space="preserve">Data Movement Gateway</w:t>
+            </w:r>
+          </w:p>
+        </w:tc>
+        <w:tc>
+          <w:tcPr>
+            <w:shd w:color="F6F7F8" w:val="solid"/>
+            <w:tcMar>
+              <w:top w:type="dxa" w:w="30"/>
+              <w:left w:type="dxa" w:w="80"/>
+              <w:bottom w:type="dxa" w:w="30"/>
+              <w:right w:type="dxa" w:w="80"/>
+            </w:tcMar>
+          </w:tcPr>
+          <w:p>
+            <w:pPr>
+              <w:spacing w:after="0"/>
+            </w:pPr>
+            <w:r>
+              <w:rPr>
+                <w:rFonts w:ascii="Inter" w:cs="Inter" w:eastAsia="Inter" w:hAnsi="Inter"/>
+                <w:color w:val="454659"/>
+                <w:sz w:val="19"/>
+                <w:szCs w:val="19"/>
+              </w:rPr>
+              <w:t xml:space="preserve">not needed</w:t>
+            </w:r>
+          </w:p>
+        </w:tc>
+        <w:tc>
+          <w:tcPr>
+            <w:shd w:color="F6F7F8" w:val="solid"/>
+            <w:tcMar>
+              <w:top w:type="dxa" w:w="30"/>
+              <w:left w:type="dxa" w:w="80"/>
+              <w:bottom w:type="dxa" w:w="30"/>
+              <w:right w:type="dxa" w:w="80"/>
+            </w:tcMar>
+          </w:tcPr>
+          <w:p>
+            <w:pPr>
+              <w:spacing w:after="0"/>
+            </w:pPr>
+            <w:r>
+              <w:rPr>
+                <w:rFonts w:ascii="Inter" w:cs="Inter" w:eastAsia="Inter" w:hAnsi="Inter"/>
+                <w:color w:val="454659"/>
+                <w:sz w:val="19"/>
+                <w:szCs w:val="19"/>
+              </w:rPr>
+              <w:t xml:space="preserve">required, registered and connected</w:t>
+            </w:r>
+          </w:p>
+        </w:tc>
+      </w:tr>
+      <w:tr>
+        <w:tc>
+          <w:tcPr>
+            <w:tcMar>
+              <w:top w:type="dxa" w:w="30"/>
+              <w:left w:type="dxa" w:w="80"/>
+              <w:bottom w:type="dxa" w:w="30"/>
+              <w:right w:type="dxa" w:w="80"/>
+            </w:tcMar>
+          </w:tcPr>
+          <w:p>
+            <w:pPr>
+              <w:spacing w:after="0"/>
+            </w:pPr>
+            <w:r>
+              <w:rPr>
+                <w:rFonts w:ascii="Inter" w:cs="Inter" w:eastAsia="Inter" w:hAnsi="Inter"/>
+                <w:color w:val="454659"/>
+                <w:sz w:val="19"/>
+                <w:szCs w:val="19"/>
+              </w:rPr>
+              <w:t xml:space="preserve">Inbound path to your databases</w:t>
+            </w:r>
+          </w:p>
+        </w:tc>
+        <w:tc>
+          <w:tcPr>
+            <w:tcMar>
+              <w:top w:type="dxa" w:w="30"/>
+              <w:left w:type="dxa" w:w="80"/>
+              <w:bottom w:type="dxa" w:w="30"/>
+              <w:right w:type="dxa" w:w="80"/>
+            </w:tcMar>
+          </w:tcPr>
+          <w:p>
+            <w:pPr>
+              <w:spacing w:after="0"/>
+            </w:pPr>
+            <w:r>
+              <w:rPr>
+                <w:rFonts w:ascii="Inter" w:cs="Inter" w:eastAsia="Inter" w:hAnsi="Inter"/>
+                <w:color w:val="454659"/>
+                <w:sz w:val="19"/>
+                <w:szCs w:val="19"/>
+              </w:rPr>
+              <w:t xml:space="preserve">not needed</w:t>
+            </w:r>
+          </w:p>
+        </w:tc>
+        <w:tc>
+          <w:tcPr>
+            <w:tcMar>
+              <w:top w:type="dxa" w:w="30"/>
+              <w:left w:type="dxa" w:w="80"/>
+              <w:bottom w:type="dxa" w:w="30"/>
+              <w:right w:type="dxa" w:w="80"/>
+            </w:tcMar>
+          </w:tcPr>
+          <w:p>
+            <w:pPr>
+              <w:spacing w:after="0"/>
+            </w:pPr>
+            <w:r>
+              <w:rPr>
+                <w:rFonts w:ascii="Inter" w:cs="Inter" w:eastAsia="Inter" w:hAnsi="Inter"/>
+                <w:color w:val="454659"/>
+                <w:sz w:val="19"/>
+                <w:szCs w:val="19"/>
+              </w:rPr>
+              <w:t xml:space="preserve">required — the gateway must reach them</w:t>
+            </w:r>
+          </w:p>
+        </w:tc>
+      </w:tr>
+      <w:tr>
+        <w:tc>
+          <w:tcPr>
+            <w:shd w:color="F6F7F8" w:val="solid"/>
+            <w:tcMar>
+              <w:top w:type="dxa" w:w="30"/>
+              <w:left w:type="dxa" w:w="80"/>
+              <w:bottom w:type="dxa" w:w="30"/>
+              <w:right w:type="dxa" w:w="80"/>
+            </w:tcMar>
+          </w:tcPr>
+          <w:p>
+            <w:pPr>
+              <w:spacing w:after="0"/>
+            </w:pPr>
+            <w:r>
+              <w:rPr>
+                <w:rFonts w:ascii="Inter" w:cs="Inter" w:eastAsia="Inter" w:hAnsi="Inter"/>
+                <w:color w:val="454659"/>
+                <w:sz w:val="19"/>
+                <w:szCs w:val="19"/>
+              </w:rPr>
+              <w:t xml:space="preserve">Source databases running</w:t>
+            </w:r>
+          </w:p>
+        </w:tc>
+        <w:tc>
+          <w:tcPr>
+            <w:shd w:color="F6F7F8" w:val="solid"/>
+            <w:tcMar>
+              <w:top w:type="dxa" w:w="30"/>
+              <w:left w:type="dxa" w:w="80"/>
+              <w:bottom w:type="dxa" w:w="30"/>
+              <w:right w:type="dxa" w:w="80"/>
+            </w:tcMar>
+          </w:tcPr>
+          <w:p>
+            <w:pPr>
+              <w:spacing w:after="0"/>
+            </w:pPr>
+            <w:r>
+              <w:rPr>
+                <w:rFonts w:ascii="Inter" w:cs="Inter" w:eastAsia="Inter" w:hAnsi="Inter"/>
+                <w:color w:val="454659"/>
+                <w:sz w:val="19"/>
+                <w:szCs w:val="19"/>
+              </w:rPr>
+              <w:t xml:space="preserve">not needed</w:t>
+            </w:r>
+          </w:p>
+        </w:tc>
+        <w:tc>
+          <w:tcPr>
+            <w:shd w:color="F6F7F8" w:val="solid"/>
+            <w:tcMar>
+              <w:top w:type="dxa" w:w="30"/>
+              <w:left w:type="dxa" w:w="80"/>
+              <w:bottom w:type="dxa" w:w="30"/>
+              <w:right w:type="dxa" w:w="80"/>
+            </w:tcMar>
+          </w:tcPr>
+          <w:p>
+            <w:pPr>
+              <w:spacing w:after="0"/>
+            </w:pPr>
+            <w:r>
+              <w:rPr>
+                <w:rFonts w:ascii="Inter" w:cs="Inter" w:eastAsia="Inter" w:hAnsi="Inter"/>
+                <w:color w:val="454659"/>
+                <w:sz w:val="19"/>
+                <w:szCs w:val="19"/>
+              </w:rPr>
+              <w:t xml:space="preserve">required</w:t>
+            </w:r>
+          </w:p>
+        </w:tc>
+      </w:tr>
+      <w:tr>
+        <w:tc>
+          <w:tcPr>
+            <w:tcMar>
+              <w:top w:type="dxa" w:w="30"/>
+              <w:left w:type="dxa" w:w="80"/>
+              <w:bottom w:type="dxa" w:w="30"/>
+              <w:right w:type="dxa" w:w="80"/>
+            </w:tcMar>
+          </w:tcPr>
+          <w:p>
+            <w:pPr>
+              <w:spacing w:after="0"/>
+            </w:pPr>
+            <w:r>
+              <w:rPr>
+                <w:rFonts w:ascii="Inter" w:cs="Inter" w:eastAsia="Inter" w:hAnsi="Inter"/>
+                <w:color w:val="454659"/>
+                <w:sz w:val="19"/>
+                <w:szCs w:val="19"/>
+              </w:rPr>
+              <w:t xml:space="preserve">Declarative pipelines</w:t>
+            </w:r>
+          </w:p>
+        </w:tc>
+        <w:tc>
+          <w:tcPr>
+            <w:tcMar>
+              <w:top w:type="dxa" w:w="30"/>
+              <w:left w:type="dxa" w:w="80"/>
+              <w:bottom w:type="dxa" w:w="30"/>
+              <w:right w:type="dxa" w:w="80"/>
+            </w:tcMar>
+          </w:tcPr>
+          <w:p>
+            <w:pPr>
+              <w:spacing w:after="0"/>
+            </w:pPr>
+            <w:r>
+              <w:rPr>
+                <w:rFonts w:ascii="Inter" w:cs="Inter" w:eastAsia="Inter" w:hAnsi="Inter"/>
+                <w:color w:val="454659"/>
+                <w:sz w:val="19"/>
+                <w:szCs w:val="19"/>
+              </w:rPr>
+              <w:t xml:space="preserve">skipped</w:t>
+            </w:r>
+          </w:p>
+        </w:tc>
+        <w:tc>
+          <w:tcPr>
+            <w:tcMar>
+              <w:top w:type="dxa" w:w="30"/>
+              <w:left w:type="dxa" w:w="80"/>
+              <w:bottom w:type="dxa" w:w="30"/>
+              <w:right w:type="dxa" w:w="80"/>
+            </w:tcMar>
+          </w:tcPr>
+          <w:p>
+            <w:pPr>
+              <w:spacing w:after="0"/>
+            </w:pPr>
+            <w:r>
+              <w:rPr>
+                <w:rFonts w:ascii="Inter" w:cs="Inter" w:eastAsia="Inter" w:hAnsi="Inter"/>
+                <w:color w:val="454659"/>
+                <w:sz w:val="19"/>
+                <w:szCs w:val="19"/>
+              </w:rPr>
+              <w:t xml:space="preserve">imported and bound</w:t>
+            </w:r>
+          </w:p>
+        </w:tc>
+      </w:tr>
+      <w:tr>
+        <w:tc>
+          <w:tcPr>
+            <w:shd w:color="F6F7F8" w:val="solid"/>
+            <w:tcMar>
+              <w:top w:type="dxa" w:w="30"/>
+              <w:left w:type="dxa" w:w="80"/>
+              <w:bottom w:type="dxa" w:w="30"/>
+              <w:right w:type="dxa" w:w="80"/>
+            </w:tcMar>
+          </w:tcPr>
+          <w:p>
+            <w:pPr>
+              <w:spacing w:after="0"/>
+            </w:pPr>
+            <w:r>
+              <w:rPr>
+                <w:rFonts w:ascii="Inter" w:cs="Inter" w:eastAsia="Inter" w:hAnsi="Inter"/>
+                <w:color w:val="454659"/>
+                <w:sz w:val="19"/>
+                <w:szCs w:val="19"/>
+              </w:rPr>
+              <w:t xml:space="preserve">How data reaches the apps</w:t>
+            </w:r>
+          </w:p>
+        </w:tc>
+        <w:tc>
+          <w:tcPr>
+            <w:shd w:color="F6F7F8" w:val="solid"/>
+            <w:tcMar>
+              <w:top w:type="dxa" w:w="30"/>
+              <w:left w:type="dxa" w:w="80"/>
+              <w:bottom w:type="dxa" w:w="30"/>
+              <w:right w:type="dxa" w:w="80"/>
+            </w:tcMar>
+          </w:tcPr>
+          <w:p>
+            <w:pPr>
+              <w:spacing w:after="0"/>
+            </w:pPr>
+            <w:r>
+              <w:rPr>
+                <w:rFonts w:ascii="Inter" w:cs="Inter" w:eastAsia="Inter" w:hAnsi="Inter"/>
+                <w:color w:val="454659"/>
+                <w:sz w:val="19"/>
+                <w:szCs w:val="19"/>
+              </w:rPr>
+              <w:t xml:space="preserve">CSVs uploaded to DataFiles, staged to QVD</w:t>
+            </w:r>
+          </w:p>
+        </w:tc>
+        <w:tc>
+          <w:tcPr>
+            <w:shd w:color="F6F7F8" w:val="solid"/>
+            <w:tcMar>
+              <w:top w:type="dxa" w:w="30"/>
+              <w:left w:type="dxa" w:w="80"/>
+              <w:bottom w:type="dxa" w:w="30"/>
+              <w:right w:type="dxa" w:w="80"/>
+            </w:tcMar>
+          </w:tcPr>
+          <w:p>
+            <w:pPr>
+              <w:spacing w:after="0"/>
+            </w:pPr>
+            <w:r>
+              <w:rPr>
+                <w:rFonts w:ascii="Inter" w:cs="Inter" w:eastAsia="Inter" w:hAnsi="Inter"/>
+                <w:color w:val="454659"/>
+                <w:sz w:val="19"/>
+                <w:szCs w:val="19"/>
+              </w:rPr>
+              <w:t xml:space="preserve">CDC through the gateway, landed to bronze</w:t>
+            </w:r>
+          </w:p>
+        </w:tc>
+      </w:tr>
+      <w:tr>
+        <w:tc>
+          <w:tcPr>
+            <w:tcMar>
+              <w:top w:type="dxa" w:w="30"/>
+              <w:left w:type="dxa" w:w="80"/>
+              <w:bottom w:type="dxa" w:w="30"/>
+              <w:right w:type="dxa" w:w="80"/>
+            </w:tcMar>
+          </w:tcPr>
+          <w:p>
+            <w:pPr>
+              <w:spacing w:after="0"/>
+            </w:pPr>
+            <w:r>
+              <w:rPr>
+                <w:rFonts w:ascii="Inter" w:cs="Inter" w:eastAsia="Inter" w:hAnsi="Inter"/>
+                <w:color w:val="454659"/>
+                <w:sz w:val="19"/>
+                <w:szCs w:val="19"/>
+              </w:rPr>
+              <w:t xml:space="preserve">Everything above storage</w:t>
+            </w:r>
+          </w:p>
+        </w:tc>
+        <w:tc>
+          <w:tcPr>
+            <w:tcMar>
+              <w:top w:type="dxa" w:w="30"/>
+              <w:left w:type="dxa" w:w="80"/>
+              <w:bottom w:type="dxa" w:w="30"/>
+              <w:right w:type="dxa" w:w="80"/>
+            </w:tcMar>
+          </w:tcPr>
+          <w:p>
+            <w:pPr>
+              <w:spacing w:after="0"/>
+            </w:pPr>
+            <w:r>
+              <w:rPr>
+                <w:rFonts w:ascii="Inter" w:cs="Inter" w:eastAsia="Inter" w:hAnsi="Inter"/>
+                <w:color w:val="454659"/>
+                <w:sz w:val="19"/>
+                <w:szCs w:val="19"/>
+              </w:rPr>
+              <w:t xml:space="preserve">identical</w:t>
+            </w:r>
+          </w:p>
+        </w:tc>
+        <w:tc>
+          <w:tcPr>
+            <w:tcMar>
+              <w:top w:type="dxa" w:w="30"/>
+              <w:left w:type="dxa" w:w="80"/>
+              <w:bottom w:type="dxa" w:w="30"/>
+              <w:right w:type="dxa" w:w="80"/>
+            </w:tcMar>
+          </w:tcPr>
+          <w:p>
+            <w:pPr>
+              <w:spacing w:after="0"/>
+            </w:pPr>
+            <w:r>
+              <w:rPr>
+                <w:rFonts w:ascii="Inter" w:cs="Inter" w:eastAsia="Inter" w:hAnsi="Inter"/>
+                <w:color w:val="454659"/>
+                <w:sz w:val="19"/>
+                <w:szCs w:val="19"/>
+              </w:rPr>
+              <w:t xml:space="preserve">identical</w:t>
+            </w:r>
+          </w:p>
+        </w:tc>
+      </w:tr>
+    </w:tbl>
+    <w:tbl>
+      <w:tblPr>
+        <w:tblW w:type="pct" w:w="100%"/>
+        <w:tblBorders>
+          <w:top w:val="single" w:color="auto" w:sz="4"/>
+          <w:left w:val="single" w:color="auto" w:sz="4"/>
+          <w:bottom w:val="single" w:color="auto" w:sz="4"/>
+          <w:right w:val="single" w:color="auto" w:sz="4"/>
+          <w:insideH w:val="single" w:color="auto" w:sz="4"/>
+          <w:insideV w:val="single" w:color="auto" w:sz="4"/>
+        </w:tblBorders>
+      </w:tblPr>
+      <w:tblGrid>
+        <w:gridCol w:w="100"/>
+        <w:gridCol w:w="100"/>
+      </w:tblGrid>
+      <w:tr>
+        <w:tc>
+          <w:tcPr>
+            <w:tcW w:type="pct" w:w="1%"/>
+            <w:tcBorders>
+              <w:top w:val="none"/>
+              <w:left w:val="none"/>
+              <w:bottom w:val="none"/>
+              <w:right w:val="none"/>
+            </w:tcBorders>
+            <w:shd w:color="006580" w:val="solid"/>
+          </w:tcPr>
+          <w:p>
+            <w:pPr>
+              <w:spacing w:after="0"/>
+            </w:pPr>
+            <w:r>
+              <w:rPr>
+                <w:sz w:val="10"/>
+                <w:szCs w:val="10"/>
+              </w:rPr>
+              <w:t xml:space="preserve"> </w:t>
+            </w:r>
+          </w:p>
+        </w:tc>
+        <w:tc>
+          <w:tcPr>
+            <w:tcW w:type="pct" w:w="99%"/>
+            <w:shd w:color="F6F7F8" w:val="solid"/>
+            <w:tcMar>
+              <w:top w:type="dxa" w:w="80"/>
+              <w:left w:type="dxa" w:w="120"/>
+              <w:bottom w:type="dxa" w:w="80"/>
+              <w:right w:type="dxa" w:w="120"/>
+            </w:tcMar>
+          </w:tcPr>
+          <w:p>
+            <w:pPr>
+              <w:spacing w:after="0"/>
+            </w:pPr>
+            <w:r>
+              <w:rPr>
+                <w:rFonts w:ascii="Inter" w:cs="Inter" w:eastAsia="Inter" w:hAnsi="Inter"/>
+                <w:color w:val="454659"/>
+                <w:sz w:val="20"/>
+                <w:szCs w:val="20"/>
+              </w:rPr>
+              <w:t xml:space="preserve">A gateway is not always possible — no host to run it on, no inbound route from Qlik Cloud to your databases, a tenant that forbids it, or a laptop demo with no network back to the source systems. QVD mode is the honest fallback: the catalog, profiling, trust scores, data products, glossary and both analytics apps behave exactly the same.</w:t>
+            </w:r>
+          </w:p>
+        </w:tc>
+      </w:tr>
+    </w:tbl>
+    <w:tbl>
+      <w:tblPr>
+        <w:tblW w:type="pct" w:w="100%"/>
+        <w:tblBorders>
+          <w:top w:val="single" w:color="auto" w:sz="4"/>
+          <w:left w:val="single" w:color="auto" w:sz="4"/>
+          <w:bottom w:val="single" w:color="auto" w:sz="4"/>
+          <w:right w:val="single" w:color="auto" w:sz="4"/>
+          <w:insideH w:val="single" w:color="auto" w:sz="4"/>
+          <w:insideV w:val="single" w:color="auto" w:sz="4"/>
+        </w:tblBorders>
+      </w:tblPr>
+      <w:tblGrid>
+        <w:gridCol w:w="100"/>
+        <w:gridCol w:w="100"/>
+      </w:tblGrid>
+      <w:tr>
+        <w:tc>
+          <w:tcPr>
+            <w:tcW w:type="pct" w:w="1%"/>
+            <w:tcBorders>
+              <w:top w:val="none"/>
+              <w:left w:val="none"/>
+              <w:bottom w:val="none"/>
+              <w:right w:val="none"/>
+            </w:tcBorders>
+            <w:shd w:color="009845" w:val="solid"/>
+          </w:tcPr>
+          <w:p>
+            <w:pPr>
+              <w:spacing w:after="0"/>
+            </w:pPr>
+            <w:r>
+              <w:rPr>
+                <w:sz w:val="10"/>
+                <w:szCs w:val="10"/>
+              </w:rPr>
+              <w:t xml:space="preserve"> </w:t>
+            </w:r>
+          </w:p>
+        </w:tc>
+        <w:tc>
+          <w:tcPr>
+            <w:tcW w:type="pct" w:w="99%"/>
+            <w:shd w:color="F6F7F8" w:val="solid"/>
+            <w:tcMar>
+              <w:top w:type="dxa" w:w="80"/>
+              <w:left w:type="dxa" w:w="120"/>
+              <w:bottom w:type="dxa" w:w="80"/>
+              <w:right w:type="dxa" w:w="120"/>
+            </w:tcMar>
+          </w:tcPr>
+          <w:p>
+            <w:pPr>
+              <w:spacing w:after="0"/>
+            </w:pPr>
+            <w:r>
+              <w:rPr>
+                <w:rFonts w:ascii="Inter" w:cs="Inter" w:eastAsia="Inter" w:hAnsi="Inter"/>
+                <w:color w:val="454659"/>
+                <w:sz w:val="20"/>
+                <w:szCs w:val="20"/>
+              </w:rPr>
+              <w:t xml:space="preserve">Pipelines land data THROUGH the gateway, so they cannot run without one. QVD mode skips the pipeline import along with the gateway-bound connections, and reports both as explicit SKIPs naming the mode rather than as failures.</w:t>
+            </w:r>
+          </w:p>
+        </w:tc>
+      </w:tr>
+    </w:tbl>
+    <w:p>
+      <w:pPr>
+        <w:spacing w:after="120"/>
+        <w:jc w:val="left"/>
+      </w:pPr>
+      <w:r>
+        <w:rPr>
+          <w:rFonts w:ascii="Inter" w:cs="Inter" w:eastAsia="Inter" w:hAnsi="Inter"/>
+          <w:b w:val="false"/>
+          <w:bCs w:val="false"/>
+          <w:i w:val="false"/>
+          <w:iCs w:val="false"/>
+          <w:color w:val="454659"/>
+          <w:sz w:val="21"/>
+          <w:szCs w:val="21"/>
+        </w:rPr>
+        <w:t xml:space="preserve">Leave dataGateway.id blank and the deploy infers QVD mode by itself. Override either way for a single run with --mode qvd or --mode gateway.</w:t>
+      </w:r>
+    </w:p>
+    <w:p>
+      <w:pPr>
+        <w:spacing w:after="120"/>
+        <w:jc w:val="left"/>
+      </w:pPr>
+      <w:r>
+        <w:rPr>
+          <w:rFonts w:ascii="Inter" w:cs="Inter" w:eastAsia="Inter" w:hAnsi="Inter"/>
+          <w:b w:val="false"/>
+          <w:bCs w:val="false"/>
+          <w:i w:val="false"/>
+          <w:iCs w:val="false"/>
+          <w:color w:val="454659"/>
+          <w:sz w:val="21"/>
+          <w:szCs w:val="21"/>
+        </w:rPr>
+        <w:t xml:space="preserve">In QVD mode the gateway, PostgreSQL and MySQL sections below are optional — read them when you move to the gateway path.</w:t>
       </w:r>
     </w:p>
     <w:p>

</xml_diff>